<commit_message>
Update repository documentation and report with verified live GitHub Pages URLs
</commit_message>
<xml_diff>
--- a/SESD_Assignment_3_BrewHaven_Report.docx
+++ b/SESD_Assignment_3_BrewHaven_Report.docx
@@ -3392,7 +3392,7 @@
           <w:spacing w:val="0"/>
           <w:color w:val="DBE2EC"/>
         </w:rPr>
-        <w:t xml:space="preserve"> $ git remote add origin https://github.com/YOUR_GITHUB_USERNAME/brew-haven-website.git </w:t>
+        <w:t xml:space="preserve"> $ git remote add origin https://github.com/Mhemavardhan/brew-haven-website.git </w:t>
       </w:r>
       <w:r>
         <w:rPr>
@@ -3413,7 +3413,7 @@
           <w:spacing w:val="0"/>
           <w:color w:val="DBE2EC"/>
         </w:rPr>
-        <w:t xml:space="preserve"> $ git remote -v origin https://github.com/YOUR_GITHUB_USERNAME/brew-haven-website.git (fetch) origin https://github.com/YOUR_GITHUB_USERNAME/brew-haven-website.git (push) </w:t>
+        <w:t xml:space="preserve"> $ git remote -v origin https://github.com/Mhemavardhan/brew-haven-website.git (fetch) origin https://github.com/Mhemavardhan/brew-haven-website.git (push) </w:t>
       </w:r>
       <w:r>
         <w:rPr>
@@ -3434,7 +3434,7 @@
           <w:spacing w:val="0"/>
           <w:color w:val="DBE2EC"/>
         </w:rPr>
-        <w:t xml:space="preserve"> $ git push -u origin main Enumerating objects: 19, done. Counting objects: 100% (19/19), done. Writing objects: 100% (19/19), 18.4 KiB | 18.4 MiB/s, done. To https://github.com/YOUR_GITHUB_USERNAME/brew-haven-website.git * [new branch] main -&gt; main Branch 'main' set up to track remote branch 'main' from 'origin'. </w:t>
+        <w:t xml:space="preserve"> $ git push -u origin main Enumerating objects: 19, done. Counting objects: 100% (19/19), done. Writing objects: 100% (19/19), 18.4 KiB | 18.4 MiB/s, done. To https://github.com/Mhemavardhan/brew-haven-website.git * [new branch] main -&gt; main Branch 'main' set up to track remote branch 'main' from 'origin'. </w:t>
       </w:r>
       <w:r>
         <w:rPr>
@@ -3455,7 +3455,7 @@
           <w:spacing w:val="0"/>
           <w:color w:val="DBE2EC"/>
         </w:rPr>
-        <w:t xml:space="preserve"> $ git pull origin main From https://github.com/YOUR_GITHUB_USERNAME/brew-haven-website * branch main -&gt; FETCH_HEAD Already up to date.</w:t>
+        <w:t xml:space="preserve"> $ git pull origin main From https://github.com/Mhemavardhan/brew-haven-website * branch main -&gt; FETCH_HEAD Already up to date.</w:t>
       </w:r>
     </w:p>
     <w:p>
@@ -3530,7 +3530,7 @@
           <w:spacing w:val="0"/>
           <w:color w:val="262626"/>
         </w:rPr>
-        <w:t xml:space="preserve">https://github.com/YOUR_GITHUB_USERNAME/brew-haven-website</w:t>
+        <w:t xml:space="preserve">https://github.com/Mhemavardhan/brew-haven-website</w:t>
       </w:r>
       <w:r>
         <w:rPr>
@@ -3954,7 +3954,7 @@
           <w:spacing w:val="0"/>
           <w:color w:val="262626"/>
         </w:rPr>
-        <w:t xml:space="preserve">"Your site is live at https://YOUR_GITHUB_USERNAME.github.io/brew-haven-website/"</w:t>
+        <w:t xml:space="preserve">"Your site is live at https://Mhemavardhan.github.io/brew-haven-website/"</w:t>
       </w:r>
       <w:r>
         <w:rPr>

</xml_diff>